<commit_message>
Initial commit: THOS with knowledge base feature with backup
</commit_message>
<xml_diff>
--- a/data/version/Improvements Required.docx
+++ b/data/version/Improvements Required.docx
@@ -595,11 +595,17 @@
       </w:r>
     </w:p>
     <w:p>
+      <w:pPr>
+        <w:rPr>
+          <w:strike/>
+        </w:rPr>
+      </w:pPr>
       <w:r>
         <w:rPr>
           <w:rFonts w:ascii="Segoe UI Emoji" w:hAnsi="Segoe UI Emoji" w:cs="Segoe UI Emoji"/>
           <w:b/>
           <w:bCs/>
+          <w:strike/>
         </w:rPr>
         <w:t>🔴</w:t>
       </w:r>
@@ -607,6 +613,7 @@
         <w:rPr>
           <w:b/>
           <w:bCs/>
+          <w:strike/>
         </w:rPr>
         <w:t xml:space="preserve"> Everything is </w:t>
       </w:r>
@@ -615,6 +622,7 @@
         <w:rPr>
           <w:b/>
           <w:bCs/>
+          <w:strike/>
         </w:rPr>
         <w:t>single-instance</w:t>
       </w:r>
@@ -623,42 +631,70 @@
         <w:rPr>
           <w:b/>
           <w:bCs/>
+          <w:strike/>
         </w:rPr>
         <w:t xml:space="preserve"> with no concurrency control.</w:t>
       </w:r>
       <w:r>
+        <w:rPr>
+          <w:strike/>
+        </w:rPr>
         <w:t xml:space="preserve"> No replicas, no load balancer, no queue. /</w:t>
       </w:r>
       <w:proofErr w:type="gramStart"/>
       <w:r>
+        <w:rPr>
+          <w:strike/>
+        </w:rPr>
         <w:t>hunt</w:t>
       </w:r>
       <w:proofErr w:type="gramEnd"/>
       <w:r>
+        <w:rPr>
+          <w:strike/>
+        </w:rPr>
         <w:t xml:space="preserve"> drives the whole </w:t>
       </w:r>
       <w:proofErr w:type="spellStart"/>
       <w:r>
+        <w:rPr>
+          <w:strike/>
+        </w:rPr>
         <w:t>LangGraph</w:t>
       </w:r>
       <w:proofErr w:type="spellEnd"/>
       <w:r>
+        <w:rPr>
+          <w:strike/>
+        </w:rPr>
         <w:t xml:space="preserve"> synchronously inside one request; concurrent hunt requests just pile up as competing </w:t>
       </w:r>
       <w:proofErr w:type="spellStart"/>
       <w:r>
+        <w:rPr>
+          <w:strike/>
+        </w:rPr>
         <w:t>asyncio</w:t>
       </w:r>
       <w:proofErr w:type="spellEnd"/>
       <w:r>
+        <w:rPr>
+          <w:strike/>
+        </w:rPr>
         <w:t xml:space="preserve"> tasks against the same single </w:t>
       </w:r>
       <w:proofErr w:type="spellStart"/>
       <w:r>
+        <w:rPr>
+          <w:strike/>
+        </w:rPr>
         <w:t>Ollama</w:t>
       </w:r>
       <w:proofErr w:type="spellEnd"/>
       <w:r>
+        <w:rPr>
+          <w:strike/>
+        </w:rPr>
         <w:t xml:space="preserve"> model, same single Postgres connection, same MCP server — with no cap and no backpressure.</w:t>
       </w:r>
     </w:p>
@@ -788,11 +824,17 @@
       </w:r>
     </w:p>
     <w:p>
+      <w:pPr>
+        <w:rPr>
+          <w:strike/>
+        </w:rPr>
+      </w:pPr>
       <w:r>
         <w:rPr>
           <w:rFonts w:ascii="Segoe UI Emoji" w:hAnsi="Segoe UI Emoji" w:cs="Segoe UI Emoji"/>
           <w:b/>
           <w:bCs/>
+          <w:strike/>
         </w:rPr>
         <w:t>🟡</w:t>
       </w:r>
@@ -800,6 +842,7 @@
         <w:rPr>
           <w:b/>
           <w:bCs/>
+          <w:strike/>
         </w:rPr>
         <w:t xml:space="preserve"> Internal services exposed </w:t>
       </w:r>
@@ -808,6 +851,7 @@
         <w:rPr>
           <w:b/>
           <w:bCs/>
+          <w:strike/>
         </w:rPr>
         <w:t>on</w:t>
       </w:r>
@@ -816,26 +860,42 @@
         <w:rPr>
           <w:b/>
           <w:bCs/>
+          <w:strike/>
         </w:rPr>
         <w:t xml:space="preserve"> host ports.</w:t>
       </w:r>
       <w:r>
+        <w:rPr>
+          <w:strike/>
+        </w:rPr>
         <w:t xml:space="preserve"> Postgres (5432), Redis (6379), </w:t>
       </w:r>
       <w:proofErr w:type="spellStart"/>
       <w:r>
+        <w:rPr>
+          <w:strike/>
+        </w:rPr>
         <w:t>Ollama</w:t>
       </w:r>
       <w:proofErr w:type="spellEnd"/>
       <w:r>
+        <w:rPr>
+          <w:strike/>
+        </w:rPr>
         <w:t xml:space="preserve"> (11434), Chroma (8000) are all published to the host rather than staying on the internal </w:t>
       </w:r>
       <w:proofErr w:type="spellStart"/>
       <w:r>
+        <w:rPr>
+          <w:strike/>
+        </w:rPr>
         <w:t>thos</w:t>
       </w:r>
       <w:proofErr w:type="spellEnd"/>
       <w:r>
+        <w:rPr>
+          <w:strike/>
+        </w:rPr>
         <w:t>-net bridge — unnecessary surface area and resource contention risk from anything else on that host.</w:t>
       </w:r>
     </w:p>
@@ -855,11 +915,17 @@
       </w:r>
     </w:p>
     <w:p>
+      <w:pPr>
+        <w:rPr>
+          <w:strike/>
+        </w:rPr>
+      </w:pPr>
       <w:r>
         <w:rPr>
           <w:rFonts w:ascii="Segoe UI Emoji" w:hAnsi="Segoe UI Emoji" w:cs="Segoe UI Emoji"/>
           <w:b/>
           <w:bCs/>
+          <w:strike/>
         </w:rPr>
         <w:t>🟠</w:t>
       </w:r>
@@ -867,26 +933,42 @@
         <w:rPr>
           <w:b/>
           <w:bCs/>
+          <w:strike/>
         </w:rPr>
         <w:t xml:space="preserve"> 2 of the 3 advertised SIEMs are still stubs.</w:t>
       </w:r>
       <w:r>
+        <w:rPr>
+          <w:strike/>
+        </w:rPr>
         <w:t xml:space="preserve"> Splunk and </w:t>
       </w:r>
       <w:proofErr w:type="spellStart"/>
       <w:r>
+        <w:rPr>
+          <w:strike/>
+        </w:rPr>
         <w:t>QRadar</w:t>
       </w:r>
       <w:proofErr w:type="spellEnd"/>
       <w:r>
+        <w:rPr>
+          <w:strike/>
+        </w:rPr>
         <w:t xml:space="preserve"> dispatch paths in siem_connector.py still raise </w:t>
       </w:r>
       <w:proofErr w:type="spellStart"/>
       <w:r>
+        <w:rPr>
+          <w:strike/>
+        </w:rPr>
         <w:t>NotImplementedError</w:t>
       </w:r>
       <w:proofErr w:type="spellEnd"/>
       <w:r>
+        <w:rPr>
+          <w:strike/>
+        </w:rPr>
         <w:t xml:space="preserve"> — only mock/folder/LogRhythm (the one I just built) are real.</w:t>
       </w:r>
     </w:p>
@@ -1311,11 +1393,17 @@
       </w:r>
     </w:p>
     <w:p>
+      <w:pPr>
+        <w:rPr>
+          <w:strike/>
+        </w:rPr>
+      </w:pPr>
       <w:r>
         <w:rPr>
           <w:rFonts w:ascii="Segoe UI Emoji" w:hAnsi="Segoe UI Emoji" w:cs="Segoe UI Emoji"/>
           <w:b/>
           <w:bCs/>
+          <w:strike/>
         </w:rPr>
         <w:t>🟡</w:t>
       </w:r>
@@ -1323,6 +1411,7 @@
         <w:rPr>
           <w:b/>
           <w:bCs/>
+          <w:strike/>
         </w:rPr>
         <w:t xml:space="preserve"> Everything logs via </w:t>
       </w:r>
@@ -1331,6 +1420,7 @@
         <w:rPr>
           <w:b/>
           <w:bCs/>
+          <w:strike/>
         </w:rPr>
         <w:t>print(</w:t>
       </w:r>
@@ -1339,18 +1429,28 @@
         <w:rPr>
           <w:b/>
           <w:bCs/>
+          <w:strike/>
         </w:rPr>
         <w:t>)</w:t>
       </w:r>
       <w:r>
+        <w:rPr>
+          <w:strike/>
+        </w:rPr>
         <w:t xml:space="preserve"> — no structured logging, no log levels, no shipping to an aggregator; debugging a production incident means grepping container </w:t>
       </w:r>
       <w:proofErr w:type="spellStart"/>
       <w:r>
+        <w:rPr>
+          <w:strike/>
+        </w:rPr>
         <w:t>stdout</w:t>
       </w:r>
       <w:proofErr w:type="spellEnd"/>
       <w:r>
+        <w:rPr>
+          <w:strike/>
+        </w:rPr>
         <w:t xml:space="preserve"> for hunt IDs by hand.</w:t>
       </w:r>
     </w:p>
@@ -1632,11 +1732,17 @@
       </w:r>
     </w:p>
     <w:p>
+      <w:pPr>
+        <w:rPr>
+          <w:strike/>
+        </w:rPr>
+      </w:pPr>
       <w:r>
         <w:rPr>
           <w:rFonts w:ascii="Segoe UI Emoji" w:hAnsi="Segoe UI Emoji" w:cs="Segoe UI Emoji"/>
           <w:b/>
           <w:bCs/>
+          <w:strike/>
         </w:rPr>
         <w:t>🟠</w:t>
       </w:r>
@@ -1644,6 +1750,7 @@
         <w:rPr>
           <w:b/>
           <w:bCs/>
+          <w:strike/>
         </w:rPr>
         <w:t xml:space="preserve"> Two </w:t>
       </w:r>
@@ -1652,6 +1759,7 @@
         <w:rPr>
           <w:b/>
           <w:bCs/>
+          <w:strike/>
         </w:rPr>
         <w:t>Dockerfiles</w:t>
       </w:r>
@@ -1660,60 +1768,100 @@
         <w:rPr>
           <w:b/>
           <w:bCs/>
+          <w:strike/>
         </w:rPr>
         <w:t xml:space="preserve"> are dead and broken.</w:t>
       </w:r>
       <w:r>
+        <w:rPr>
+          <w:strike/>
+        </w:rPr>
         <w:t xml:space="preserve"> The top-</w:t>
       </w:r>
       <w:proofErr w:type="gramStart"/>
       <w:r>
+        <w:rPr>
+          <w:strike/>
+        </w:rPr>
         <w:t>level .</w:t>
       </w:r>
       <w:proofErr w:type="gramEnd"/>
       <w:r>
+        <w:rPr>
+          <w:strike/>
+        </w:rPr>
         <w:t>/</w:t>
       </w:r>
       <w:proofErr w:type="spellStart"/>
       <w:r>
+        <w:rPr>
+          <w:strike/>
+        </w:rPr>
         <w:t>Dockerfile</w:t>
       </w:r>
       <w:proofErr w:type="spellEnd"/>
       <w:r>
+        <w:rPr>
+          <w:strike/>
+        </w:rPr>
         <w:t xml:space="preserve"> and services/</w:t>
       </w:r>
       <w:proofErr w:type="spellStart"/>
       <w:r>
+        <w:rPr>
+          <w:strike/>
+        </w:rPr>
         <w:t>mcp</w:t>
       </w:r>
       <w:proofErr w:type="spellEnd"/>
       <w:r>
+        <w:rPr>
+          <w:strike/>
+        </w:rPr>
         <w:t>/</w:t>
       </w:r>
       <w:proofErr w:type="spellStart"/>
       <w:r>
+        <w:rPr>
+          <w:strike/>
+        </w:rPr>
         <w:t>Dockerfile</w:t>
       </w:r>
       <w:proofErr w:type="spellEnd"/>
       <w:r>
+        <w:rPr>
+          <w:strike/>
+        </w:rPr>
         <w:t xml:space="preserve"> both reference an app/ package layout (</w:t>
       </w:r>
       <w:proofErr w:type="spellStart"/>
       <w:proofErr w:type="gramStart"/>
       <w:r>
+        <w:rPr>
+          <w:strike/>
+        </w:rPr>
         <w:t>app.server</w:t>
       </w:r>
       <w:proofErr w:type="spellEnd"/>
       <w:proofErr w:type="gramEnd"/>
       <w:r>
+        <w:rPr>
+          <w:strike/>
+        </w:rPr>
         <w:t>, COPY app /app) that doesn't exist in this repo anymore — everything moved to services/. Neither is referenced by docker-</w:t>
       </w:r>
       <w:proofErr w:type="spellStart"/>
       <w:r>
+        <w:rPr>
+          <w:strike/>
+        </w:rPr>
         <w:t>compose.yml</w:t>
       </w:r>
       <w:proofErr w:type="spellEnd"/>
       <w:r>
+        <w:rPr>
+          <w:strike/>
+        </w:rPr>
         <w:t>. They'll fail to build if anyone tries to use them and will confuse new contributors.</w:t>
       </w:r>
     </w:p>

</xml_diff>